<commit_message>
strip placeholder body content from all 5 templates
DOCX templates: deleted all body stubs (headings, tables, chart
placeholders, section placeholders) between cover page and final
sectPr. Cover page and footer placeholders preserved:
[CLIENT COMPANY NAME], [ENGAGEMENT DATE].

PPTX template: cleared bracket placeholder text on slides 2-11,
kept slide 1 title slide with [CLIENT COMPANY NAME] and [DATE].

Co-Authored-By: Claude Opus 4.6 (1M context) <noreply@anthropic.com>
</commit_message>
<xml_diff>
--- a/backend/templates/17_Phase2_Retainer_Proposal.docx
+++ b/backend/templates/17_Phase2_Retainer_Proposal.docx
@@ -223,169 +223,6 @@
           <w:docGrid w:linePitch="360"/>
         </w:sectPr>
       </w:pPr>
-    </w:p>
-    <w:p>
-      <w:pPr>
-        <w:pStyle w:val="Heading1"/>
-      </w:pPr>
-      <w:r>
-        <w:lastRenderedPageBreak/>
-        <w:t>1. Proposal Summary</w:t>
-      </w:r>
-    </w:p>
-    <w:p>
-      <w:pPr>
-        <w:spacing w:before="120" w:after="120"/>
-      </w:pPr>
-      <w:r>
-        <w:t>[SECTION 1: PROPOSAL SUMMARY - Table with Field/Detail columns. Rows: Client ([CLIENT COMPANY NAME]), Service (Phase 2 Implementation Retainer), Retainer Options ($5,000/month Standard, $10,000/month Accelerated), Recommended Duration (6 months with date range), Proposed Start Date (within 30 days of debrief), Based On (engagement ID reference).]</w:t>
-      </w:r>
-    </w:p>
-    <w:p>
-      <w:pPr>
-        <w:pStyle w:val="Heading1"/>
-      </w:pPr>
-      <w:r>
-        <w:t>2. The Opportunity</w:t>
-      </w:r>
-    </w:p>
-    <w:p>
-      <w:pPr>
-        <w:spacing w:before="120" w:after="120"/>
-      </w:pPr>
-      <w:r>
-        <w:t>[SECTION 2: THE OPPORTUNITY - 2 paragraphs: total recoverable margin, net after investment, percentage of revenue, purpose of Phase 2 retainer. Opportunity summary table with columns: Category, Identified Amount, 90-Day Capture Potential. Rows: Quick Wins, Efficiency Gains, Strategic Investments, Total. Paragraph explaining each category.]</w:t>
-      </w:r>
-    </w:p>
-    <w:p>
-      <w:pPr>
-        <w:pStyle w:val="Heading1"/>
-      </w:pPr>
-      <w:r>
-        <w:t>3. Diagnostic Recap — Key Findings</w:t>
-      </w:r>
-    </w:p>
-    <w:p>
-      <w:pPr>
-        <w:spacing w:before="120" w:after="120"/>
-      </w:pPr>
-      <w:r>
-        <w:t>[SECTION 3: DIAGNOSTIC RECAP - Top 5 findings with dollar amounts and 1-paragraph descriptions for each. Each finding covers: the problem, root cause, quantification, and recommended action. Closing sentence referencing the Full Diagnostic Report and Workbook.]</w:t>
-      </w:r>
-    </w:p>
-    <w:p>
-      <w:pPr>
-        <w:pStyle w:val="Heading1"/>
-      </w:pPr>
-      <w:r>
-        <w:t>4. Retainer Tiers</w:t>
-      </w:r>
-    </w:p>
-    <w:p>
-      <w:pPr>
-        <w:spacing w:before="120" w:after="120"/>
-      </w:pPr>
-      <w:r>
-        <w:t>[SECTION 4: RETAINER TIERS - Comparison table: Feature, Standard ($5K/mo), Accelerated ($10K/mo). Features: monthly strategy sessions, weekly check-ins, KPI dashboard review, email support response time, vendor negotiation support, workflow redesign, financial modeling, deep-dive deliverables per month, quarterly board report, automation templates, monthly progress summary. Recommendation paragraph for the appropriate tier based on engagement complexity.]</w:t>
-      </w:r>
-    </w:p>
-    <w:p>
-      <w:pPr>
-        <w:pStyle w:val="Heading1"/>
-      </w:pPr>
-      <w:r>
-        <w:t>5. Implementation Scope</w:t>
-      </w:r>
-    </w:p>
-    <w:p>
-      <w:pPr>
-        <w:spacing w:before="120" w:after="120"/>
-      </w:pPr>
-      <w:r>
-        <w:t>[SECTION 5: IMPLEMENTATION SCOPE - 6-8 named workstreams derived from the diagnostic findings. Each workstream: 1-2 sentences describing what BaxterLabs will do and the target outcome. Typical workstreams: vendor renegotiation, pricing optimization, utilization management, hiring support, retention program, KPI dashboard, roadmap accountability.]</w:t>
-      </w:r>
-    </w:p>
-    <w:p>
-      <w:pPr>
-        <w:pStyle w:val="Heading1"/>
-      </w:pPr>
-      <w:r>
-        <w:t>6. Projected ROI</w:t>
-      </w:r>
-    </w:p>
-    <w:p>
-      <w:pPr>
-        <w:spacing w:before="120" w:after="120"/>
-      </w:pPr>
-      <w:r>
-        <w:t>[SECTION 6: PROJECTED ROI - Table with Conservative and Moderate columns: Annual recoverable margin, Net after investment, Phase 1 fee ($12,500), Phase 2 retainer (6 months), Total BaxterLabs investment, ROI multiple. Paragraph on historical capture rates for firms with vs without Phase 2 support.]</w:t>
-      </w:r>
-    </w:p>
-    <w:p>
-      <w:pPr>
-        <w:pStyle w:val="Heading1"/>
-      </w:pPr>
-      <w:r>
-        <w:lastRenderedPageBreak/>
-        <w:t>7. Payment Terms</w:t>
-      </w:r>
-    </w:p>
-    <w:p>
-      <w:pPr>
-        <w:spacing w:before="120" w:after="120"/>
-      </w:pPr>
-      <w:r>
-        <w:t>[SECTION 7: PAYMENT TERMS - Table with columns: Term, Standard, Accelerated. Rows: Monthly Fee ($5,000/$10,000), Billing Cycle (monthly in advance), Minimum Term (month-to-month), Cancellation Notice (30 days written), Payment Method (ACH/Wire/Check). Brief paragraph on billing mechanics.]</w:t>
-      </w:r>
-    </w:p>
-    <w:p>
-      <w:pPr>
-        <w:pStyle w:val="Heading1"/>
-      </w:pPr>
-      <w:r>
-        <w:t>8. Why Now</w:t>
-      </w:r>
-    </w:p>
-    <w:p>
-      <w:pPr>
-        <w:spacing w:before="120" w:after="120"/>
-      </w:pPr>
-      <w:r>
-        <w:t>[SECTION 8: WHY NOW - 2-3 paragraphs: 90-day implementation window urgency, monthly cost of delay, timing dependencies specific to the client (renewal cycles, hiring windows, engagement cycles), closing call to action.]</w:t>
-      </w:r>
-    </w:p>
-    <w:p>
-      <w:pPr>
-        <w:pStyle w:val="Heading1"/>
-      </w:pPr>
-      <w:r>
-        <w:t>9. Acceptance</w:t>
-      </w:r>
-    </w:p>
-    <w:p>
-      <w:pPr>
-        <w:spacing w:before="120" w:after="120"/>
-      </w:pPr>
-      <w:r>
-        <w:t>[SECTION 9: ACCEPTANCE - Signature block with fields for: Authorized Signature, Printed Name and Title, Date, Proposed Start Date, Tier selection checkboxes (Standard $5,000/mo and Accelerated $10,000/mo). BaxterLabs contact line.]</w:t>
-      </w:r>
-    </w:p>
-    <w:p>
-      <w:pPr>
-        <w:pStyle w:val="Heading1"/>
-        <w:spacing w:before="400"/>
-      </w:pPr>
-      <w:r>
-        <w:t>Endnotes — Citation Index</w:t>
-      </w:r>
-    </w:p>
-    <w:p>
-      <w:pPr>
-        <w:spacing w:before="120" w:after="120"/>
-      </w:pPr>
-      <w:r>
-        <w:t>[ENDNOTES: Full citation index with numbered entries. Each follows BaxterLabs Citation Provenance Standard: [Confidence Level: Source, location].]</w:t>
-      </w:r>
     </w:p>
     <w:sectPr>
       <w:headerReference w:type="default" r:id="rId14"/>

</xml_diff>

<commit_message>
fix renderer frontmatter stripping, horizontal rules, and rename Phase 2 Retainer
- Rewrite _strip_title_frontmatter() to remove all metadata lines (title,
  bylines, author names, CONFIDENTIAL, dates, horizontal rules) until the
  first real content heading
- Widen horizontal rule detection to ^[-*_]{3,}$ and add break in paragraph
  collector so --- never leaks into body text
- Remove "14-Day" from all 4 DOCX cover page templates
- Rename "PHASE 2 RETAINER PROPOSAL" to "RETAINER PROPOSAL" in template
- Change engagement date format from "%B %Y" to "%B %-d, %Y" for full dates
- Rename "Phase 2 Retainer Proposal" to "Retainer Proposal" across seed data,
  renderer display names, email templates, deliverables router, frontend labels,
  and database (templates + phase_outputs tables)

Co-Authored-By: Claude Opus 4.6 (1M context) <noreply@anthropic.com>
</commit_message>
<xml_diff>
--- a/backend/templates/17_Phase2_Retainer_Proposal.docx
+++ b/backend/templates/17_Phase2_Retainer_Proposal.docx
@@ -106,7 +106,7 @@
           <w:sz w:val="44"/>
           <w:szCs w:val="44"/>
         </w:rPr>
-        <w:t>PHASE 2 RETAINER PROPOSAL</w:t>
+        <w:t>RETAINER PROPOSAL</w:t>
       </w:r>
     </w:p>
     <w:p>
@@ -124,7 +124,7 @@
           <w:sz w:val="24"/>
           <w:szCs w:val="24"/>
         </w:rPr>
-        <w:t>14-Day Profit Leak &amp; Operational Efficiency Diagnostic</w:t>
+        <w:t>Profit Leak &amp; Operational Efficiency Diagnostic</w:t>
       </w:r>
     </w:p>
     <w:p>

</xml_diff>